<commit_message>
Modelo conceitual desenhado no brModelo 3.31 (.brM3 + XML nativo + print) e relatório atualizado
- gerar_brmodelo.py gera o XML nativo do brModelo 3; ConverteBrM3.java abre o XML
  com as classes do brModelo e grava o .brM3 (serialização oficial) e o PNG
- round-trip verificado: .brM3 reaberto pelo brModelo com 79 itens, versão 3.2.0
- relatório ABNT (docx/pdf) passa a usar o print do brModelo como Figura 1

Co-Authored-By: Claude Fable 5.1 <noreply@anthropic.com>
</commit_message>
<xml_diff>
--- a/docs/Entrega_Case_Bolsa_Valores.docx
+++ b/docs/Entrega_Case_Bolsa_Valores.docx
@@ -1414,7 +1414,7 @@
           <w:color w:val="000000"/>
           <w:sz w:val="20"/>
         </w:rPr>
-        <w:t xml:space="preserve"> – Modelo conceitual em notação Entidade-Relacionamento (Chen)</w:t>
+        <w:t xml:space="preserve"> – Modelo conceitual em notação Entidade-Relacionamento, elaborado no brModelo 3.31</w:t>
       </w:r>
     </w:p>
     <w:p>
@@ -1427,7 +1427,7 @@
       <w:r>
         <w:drawing>
           <wp:inline xmlns:a="http://schemas.openxmlformats.org/drawingml/2006/main" xmlns:pic="http://schemas.openxmlformats.org/drawingml/2006/picture">
-            <wp:extent cx="6540139" cy="4860000"/>
+            <wp:extent cx="8892000" cy="4643467"/>
             <wp:docPr id="1" name="Picture 1"/>
             <wp:cNvGraphicFramePr>
               <a:graphicFrameLocks noChangeAspect="1"/>
@@ -1436,7 +1436,7 @@
               <a:graphicData uri="http://schemas.openxmlformats.org/drawingml/2006/picture">
                 <pic:pic>
                   <pic:nvPicPr>
-                    <pic:cNvPr id="0" name="modelo_conceitual.png"/>
+                    <pic:cNvPr id="0" name="modelo_conceitual_brmodelo.png"/>
                     <pic:cNvPicPr/>
                   </pic:nvPicPr>
                   <pic:blipFill>
@@ -1448,7 +1448,7 @@
                   <pic:spPr>
                     <a:xfrm>
                       <a:off x="0" y="0"/>
-                      <a:ext cx="6540139" cy="4860000"/>
+                      <a:ext cx="8892000" cy="4643467"/>
                     </a:xfrm>
                     <a:prstGeom prst="rect"/>
                   </pic:spPr>

</xml_diff>